<commit_message>
Consolidate freelance history into Malcolm Xavier Consulting on the resume
Replace the Freelance and Independent Consulting entries with a single
practice entry (Principal Consultant, Feb 2022 - Present, Remote), and
link presentation lines from the education entries to their project
detail pages. Onsite carries both MSL presentations; the docx keeps the
second-year privacy paper only, an intentional divergence documented in
SURFACES.md. Regenerate the docx, PDF, and bullet-bank artifacts.

Co-Authored-By: Claude Opus 4.8 <noreply@anthropic.com>
</commit_message>
<xml_diff>
--- a/public/resume/malcolm-xavier-bullet-bank-template.docx
+++ b/public/resume/malcolm-xavier-bullet-bank-template.docx
@@ -33,14 +33,14 @@
           <w:sz w:val="21"/>
           <w:szCs w:val="21"/>
         </w:rPr>
-        <w:t xml:space="preserve">Senior Product Manager · Growth and Data · Media, Publishing, and Streaming · AI-Native</w:t>
+        <w:t xml:space="preserve">Senior Product Manager · Growth and Data Platform · Media, Publishing, and Streaming · AI-Native</w:t>
       </w:r>
     </w:p>
     <w:p>
       <w:pPr>
         <w:spacing w:after="240" w:before="0"/>
       </w:pPr>
-      <w:hyperlink w:history="1" r:id="rIdhybxefihqvru7rkpopof9">
+      <w:hyperlink w:history="1" r:id="rIdxhrg_xaqb0vg95y-ld6wc">
         <w:r>
           <w:rPr>
             <w:rFonts w:ascii="DM Sans" w:cs="DM Sans" w:eastAsia="DM Sans" w:hAnsi="DM Sans"/>
@@ -69,7 +69,7 @@
         </w:rPr>
         <w:t xml:space="preserve"> · </w:t>
       </w:r>
-      <w:hyperlink w:history="1" r:id="rId4f3lhss7isxijwkustlpv">
+      <w:hyperlink w:history="1" r:id="rIdhkmikxtljxlt3x7yifiqp">
         <w:r>
           <w:rPr>
             <w:rFonts w:ascii="DM Sans" w:cs="DM Sans" w:eastAsia="DM Sans" w:hAnsi="DM Sans"/>
@@ -98,7 +98,7 @@
         </w:rPr>
         <w:t xml:space="preserve"> · </w:t>
       </w:r>
-      <w:hyperlink w:history="1" r:id="rIdxymbfhhfmek_r5y0nabe8">
+      <w:hyperlink w:history="1" r:id="rIdtttxdye5hufwxhe64aowc">
         <w:r>
           <w:rPr>
             <w:rFonts w:ascii="DM Sans" w:cs="DM Sans" w:eastAsia="DM Sans" w:hAnsi="DM Sans"/>
@@ -196,7 +196,20 @@
           <w:sz w:val="24"/>
           <w:szCs w:val="24"/>
         </w:rPr>
-        <w:t xml:space="preserve">Freelance</w:t>
+        <w:t xml:space="preserve">Malcolm Xavier Consulting</w:t>
+      </w:r>
+      <w:r>
+        <w:rPr>
+          <w:rFonts w:ascii="DM Sans" w:cs="DM Sans" w:eastAsia="DM Sans" w:hAnsi="DM Sans"/>
+          <w:b w:val="false"/>
+          <w:bCs w:val="false"/>
+          <w:i w:val="false"/>
+          <w:iCs w:val="false"/>
+          <w:color w:val="000000"/>
+          <w:sz w:val="24"/>
+          <w:szCs w:val="24"/>
+        </w:rPr>
+        <w:t xml:space="preserve"> — Los Angeles, CA · Remote</w:t>
       </w:r>
     </w:p>
     <w:p>
@@ -204,12 +217,75 @@
         <w:keepNext/>
         <w:spacing w:after="60" w:before="0"/>
       </w:pPr>
-      <w:hyperlink w:history="1" r:id="rIdqvmoiclee5oltbvcruhrf">
+      <w:r>
+        <w:rPr>
+          <w:rFonts w:ascii="DM Sans" w:cs="DM Sans" w:eastAsia="DM Sans" w:hAnsi="DM Sans"/>
+          <w:b/>
+          <w:bCs/>
+          <w:i w:val="false"/>
+          <w:iCs w:val="false"/>
+          <w:color w:val="000000"/>
+          <w:sz w:val="21"/>
+          <w:szCs w:val="21"/>
+        </w:rPr>
+        <w:t xml:space="preserve">Principal Consultant</w:t>
+      </w:r>
+      <w:r>
+        <w:rPr>
+          <w:rFonts w:ascii="DM Sans" w:cs="DM Sans" w:eastAsia="DM Sans" w:hAnsi="DM Sans"/>
+          <w:b w:val="false"/>
+          <w:bCs w:val="false"/>
+          <w:i w:val="false"/>
+          <w:iCs w:val="false"/>
+          <w:color w:val="000000"/>
+          <w:sz w:val="21"/>
+          <w:szCs w:val="21"/>
+        </w:rPr>
+        <w:t xml:space="preserve"> — Feb 2022 – Present</w:t>
+      </w:r>
+    </w:p>
+    <w:p>
+      <w:pPr>
+        <w:pStyle w:val="ListParagraph"/>
+        <w:keepNext/>
+        <w:numPr>
+          <w:ilvl w:val="0"/>
+          <w:numId w:val="1"/>
+        </w:numPr>
+        <w:spacing w:after="40" w:before="0"/>
+        <w:ind w:left="288"/>
+      </w:pPr>
+      <w:r>
+        <w:rPr>
+          <w:rFonts w:ascii="DM Sans" w:cs="DM Sans" w:eastAsia="DM Sans" w:hAnsi="DM Sans"/>
+          <w:b w:val="false"/>
+          <w:bCs w:val="false"/>
+          <w:i w:val="false"/>
+          <w:iCs w:val="false"/>
+          <w:color w:val="000000"/>
+          <w:sz w:val="21"/>
+          <w:szCs w:val="21"/>
+        </w:rPr>
+        <w:t xml:space="preserve">Build and operate my own products—malxavi.com and the editorial operation behind my published writing—on an AI-native setup, with agentic workflows in the loop from roadmap to ship</w:t>
+      </w:r>
+    </w:p>
+    <w:p>
+      <w:pPr>
+        <w:pStyle w:val="ListParagraph"/>
+        <w:keepNext/>
+        <w:numPr>
+          <w:ilvl w:val="0"/>
+          <w:numId w:val="1"/>
+        </w:numPr>
+        <w:spacing w:after="40" w:before="0"/>
+        <w:ind w:left="288"/>
+      </w:pPr>
+      <w:hyperlink w:history="1" r:id="rId4fknurwe1kurvnkbqcygu">
         <w:r>
           <w:rPr>
             <w:rFonts w:ascii="DM Sans" w:cs="DM Sans" w:eastAsia="DM Sans" w:hAnsi="DM Sans"/>
-            <w:b/>
-            <w:bCs/>
+            <w:b w:val="false"/>
+            <w:bCs w:val="false"/>
             <w:i w:val="false"/>
             <w:iCs w:val="false"/>
             <w:color w:val="000000"/>
@@ -217,7 +293,7 @@
             <w:szCs w:val="21"/>
             <w:u w:val="single" w:color="000000"/>
           </w:rPr>
-          <w:t xml:space="preserve">Prompt Engineer (via DataAnnotation.tech)</w:t>
+          <w:t xml:space="preserve">Fleet</w:t>
         </w:r>
       </w:hyperlink>
       <w:r>
@@ -231,81 +307,342 @@
           <w:sz w:val="21"/>
           <w:szCs w:val="21"/>
         </w:rPr>
-        <w:t xml:space="preserve"> — Sep 2023 – Present</w:t>
-      </w:r>
-    </w:p>
-    <w:p>
-      <w:pPr>
-        <w:pStyle w:val="ListParagraph"/>
-        <w:keepNext/>
-        <w:numPr>
-          <w:ilvl w:val="0"/>
-          <w:numId w:val="1"/>
-        </w:numPr>
-        <w:spacing w:after="40" w:before="0"/>
-        <w:ind w:left="288"/>
-      </w:pPr>
-      <w:r>
-        <w:rPr>
-          <w:rFonts w:ascii="DM Sans" w:cs="DM Sans" w:eastAsia="DM Sans" w:hAnsi="DM Sans"/>
-          <w:b w:val="false"/>
-          <w:bCs w:val="false"/>
-          <w:i w:val="false"/>
-          <w:iCs w:val="false"/>
-          <w:color w:val="000000"/>
-          <w:sz w:val="21"/>
-          <w:szCs w:val="21"/>
-        </w:rPr>
-        <w:t xml:space="preserve">Train LLM models (GPT-5, Gemini 2.5 Pro, etc.) across various agentic, RAG use cases</w:t>
-      </w:r>
-    </w:p>
-    <w:p>
-      <w:pPr>
-        <w:pStyle w:val="ListParagraph"/>
-        <w:keepNext/>
-        <w:numPr>
-          <w:ilvl w:val="0"/>
-          <w:numId w:val="1"/>
-        </w:numPr>
-        <w:spacing w:after="40" w:before="0"/>
-        <w:ind w:left="288"/>
-      </w:pPr>
-      <w:r>
-        <w:rPr>
-          <w:rFonts w:ascii="DM Sans" w:cs="DM Sans" w:eastAsia="DM Sans" w:hAnsi="DM Sans"/>
-          <w:b w:val="false"/>
-          <w:bCs w:val="false"/>
-          <w:i w:val="false"/>
-          <w:iCs w:val="false"/>
-          <w:color w:val="000000"/>
-          <w:sz w:val="21"/>
-          <w:szCs w:val="21"/>
-        </w:rPr>
-        <w:t xml:space="preserve">Write prompts, criteria, and rubrics; and evaluate responses across various legal topics</w:t>
-      </w:r>
-    </w:p>
-    <w:p>
-      <w:pPr>
-        <w:pStyle w:val="ListParagraph"/>
-        <w:numPr>
-          <w:ilvl w:val="0"/>
-          <w:numId w:val="1"/>
-        </w:numPr>
-        <w:spacing w:after="40" w:before="0"/>
-        <w:ind w:left="288"/>
-      </w:pPr>
-      <w:r>
-        <w:rPr>
-          <w:rFonts w:ascii="DM Sans" w:cs="DM Sans" w:eastAsia="DM Sans" w:hAnsi="DM Sans"/>
-          <w:b w:val="false"/>
-          <w:bCs w:val="false"/>
-          <w:i w:val="false"/>
-          <w:iCs w:val="false"/>
-          <w:color w:val="000000"/>
-          <w:sz w:val="21"/>
-          <w:szCs w:val="21"/>
-        </w:rPr>
-        <w:t xml:space="preserve">Review, evaluate, and revise the work of other freelancers to ensure proper model training</w:t>
+        <w:t xml:space="preserve"> (2026–present): AI training and evaluation—prompting techniques, evaluation rubrics, and agent-behavior assessment for simulated-environment research</w:t>
+      </w:r>
+    </w:p>
+    <w:p>
+      <w:pPr>
+        <w:pStyle w:val="ListParagraph"/>
+        <w:keepNext/>
+        <w:numPr>
+          <w:ilvl w:val="0"/>
+          <w:numId w:val="1"/>
+        </w:numPr>
+        <w:spacing w:after="40" w:before="0"/>
+        <w:ind w:left="288"/>
+      </w:pPr>
+      <w:hyperlink w:history="1" r:id="rIdp0ow5ay6jrf5ga97kopv_">
+        <w:r>
+          <w:rPr>
+            <w:rFonts w:ascii="DM Sans" w:cs="DM Sans" w:eastAsia="DM Sans" w:hAnsi="DM Sans"/>
+            <w:b w:val="false"/>
+            <w:bCs w:val="false"/>
+            <w:i w:val="false"/>
+            <w:iCs w:val="false"/>
+            <w:color w:val="000000"/>
+            <w:sz w:val="21"/>
+            <w:szCs w:val="21"/>
+            <w:u w:val="single" w:color="000000"/>
+          </w:rPr>
+          <w:t xml:space="preserve">DataAnnotation</w:t>
+        </w:r>
+      </w:hyperlink>
+      <w:r>
+        <w:rPr>
+          <w:rFonts w:ascii="DM Sans" w:cs="DM Sans" w:eastAsia="DM Sans" w:hAnsi="DM Sans"/>
+          <w:b w:val="false"/>
+          <w:bCs w:val="false"/>
+          <w:i w:val="false"/>
+          <w:iCs w:val="false"/>
+          <w:color w:val="000000"/>
+          <w:sz w:val="21"/>
+          <w:szCs w:val="21"/>
+        </w:rPr>
+        <w:t xml:space="preserve"> (2023–2026): trained LLM models (GPT-5, Gemini 2.5 Pro, etc.) across various agentic and RAG use cases</w:t>
+      </w:r>
+    </w:p>
+    <w:p>
+      <w:pPr>
+        <w:pStyle w:val="ListParagraph"/>
+        <w:keepNext/>
+        <w:numPr>
+          <w:ilvl w:val="0"/>
+          <w:numId w:val="1"/>
+        </w:numPr>
+        <w:spacing w:after="40" w:before="0"/>
+        <w:ind w:left="288"/>
+      </w:pPr>
+      <w:r>
+        <w:rPr>
+          <w:rFonts w:ascii="DM Sans" w:cs="DM Sans" w:eastAsia="DM Sans" w:hAnsi="DM Sans"/>
+          <w:b w:val="false"/>
+          <w:bCs w:val="false"/>
+          <w:i w:val="false"/>
+          <w:iCs w:val="false"/>
+          <w:color w:val="000000"/>
+          <w:sz w:val="21"/>
+          <w:szCs w:val="21"/>
+        </w:rPr>
+        <w:t xml:space="preserve">Wrote prompts, criteria, and rubrics; and evaluated responses across various legal topics</w:t>
+      </w:r>
+    </w:p>
+    <w:p>
+      <w:pPr>
+        <w:pStyle w:val="ListParagraph"/>
+        <w:keepNext/>
+        <w:numPr>
+          <w:ilvl w:val="0"/>
+          <w:numId w:val="1"/>
+        </w:numPr>
+        <w:spacing w:after="40" w:before="0"/>
+        <w:ind w:left="288"/>
+      </w:pPr>
+      <w:r>
+        <w:rPr>
+          <w:rFonts w:ascii="DM Sans" w:cs="DM Sans" w:eastAsia="DM Sans" w:hAnsi="DM Sans"/>
+          <w:b w:val="false"/>
+          <w:bCs w:val="false"/>
+          <w:i w:val="false"/>
+          <w:iCs w:val="false"/>
+          <w:color w:val="000000"/>
+          <w:sz w:val="21"/>
+          <w:szCs w:val="21"/>
+        </w:rPr>
+        <w:t xml:space="preserve">Reviewed, evaluated, and revised the work of other contributors to ensure proper model training</w:t>
+      </w:r>
+    </w:p>
+    <w:p>
+      <w:pPr>
+        <w:pStyle w:val="ListParagraph"/>
+        <w:keepNext/>
+        <w:numPr>
+          <w:ilvl w:val="0"/>
+          <w:numId w:val="1"/>
+        </w:numPr>
+        <w:spacing w:after="40" w:before="0"/>
+        <w:ind w:left="288"/>
+      </w:pPr>
+      <w:r>
+        <w:rPr>
+          <w:rFonts w:ascii="DM Sans" w:cs="DM Sans" w:eastAsia="DM Sans" w:hAnsi="DM Sans"/>
+          <w:b w:val="false"/>
+          <w:bCs w:val="false"/>
+          <w:i w:val="false"/>
+          <w:iCs w:val="false"/>
+          <w:color w:val="000000"/>
+          <w:sz w:val="21"/>
+          <w:szCs w:val="21"/>
+        </w:rPr>
+        <w:t xml:space="preserve">Created content marketing strategy for </w:t>
+      </w:r>
+      <w:hyperlink w:history="1" r:id="rIddwyqwtsff2u1tzxncpsd0">
+        <w:r>
+          <w:rPr>
+            <w:rFonts w:ascii="DM Sans" w:cs="DM Sans" w:eastAsia="DM Sans" w:hAnsi="DM Sans"/>
+            <w:b w:val="false"/>
+            <w:bCs w:val="false"/>
+            <w:i w:val="false"/>
+            <w:iCs w:val="false"/>
+            <w:color w:val="000000"/>
+            <w:sz w:val="21"/>
+            <w:szCs w:val="21"/>
+            <w:u w:val="single" w:color="000000"/>
+          </w:rPr>
+          <w:t xml:space="preserve">New England Foundation for the Arts</w:t>
+        </w:r>
+      </w:hyperlink>
+      <w:r>
+        <w:rPr>
+          <w:rFonts w:ascii="DM Sans" w:cs="DM Sans" w:eastAsia="DM Sans" w:hAnsi="DM Sans"/>
+          <w:b w:val="false"/>
+          <w:bCs w:val="false"/>
+          <w:i w:val="false"/>
+          <w:iCs w:val="false"/>
+          <w:color w:val="000000"/>
+          <w:sz w:val="21"/>
+          <w:szCs w:val="21"/>
+        </w:rPr>
+        <w:t xml:space="preserve"> (2022)</w:t>
+      </w:r>
+    </w:p>
+    <w:p>
+      <w:pPr>
+        <w:pStyle w:val="ListParagraph"/>
+        <w:keepNext/>
+        <w:numPr>
+          <w:ilvl w:val="0"/>
+          <w:numId w:val="1"/>
+        </w:numPr>
+        <w:spacing w:after="40" w:before="0"/>
+        <w:ind w:left="288"/>
+      </w:pPr>
+      <w:r>
+        <w:rPr>
+          <w:rFonts w:ascii="DM Sans" w:cs="DM Sans" w:eastAsia="DM Sans" w:hAnsi="DM Sans"/>
+          <w:b w:val="false"/>
+          <w:bCs w:val="false"/>
+          <w:i w:val="false"/>
+          <w:iCs w:val="false"/>
+          <w:color w:val="000000"/>
+          <w:sz w:val="21"/>
+          <w:szCs w:val="21"/>
+        </w:rPr>
+        <w:t xml:space="preserve">Developed analytics system architecture, data strategy, and dashboards for a private client (2022)</w:t>
+      </w:r>
+    </w:p>
+    <w:p>
+      <w:pPr>
+        <w:pStyle w:val="ListParagraph"/>
+        <w:keepNext/>
+        <w:numPr>
+          <w:ilvl w:val="0"/>
+          <w:numId w:val="1"/>
+        </w:numPr>
+        <w:spacing w:after="40" w:before="0"/>
+        <w:ind w:left="288"/>
+      </w:pPr>
+      <w:r>
+        <w:rPr>
+          <w:rFonts w:ascii="DM Sans" w:cs="DM Sans" w:eastAsia="DM Sans" w:hAnsi="DM Sans"/>
+          <w:b w:val="false"/>
+          <w:bCs w:val="false"/>
+          <w:i w:val="false"/>
+          <w:iCs w:val="false"/>
+          <w:color w:val="000000"/>
+          <w:sz w:val="21"/>
+          <w:szCs w:val="21"/>
+        </w:rPr>
+        <w:t xml:space="preserve">Leveraged PM expertise to provide holistic consultation on specific business operations</w:t>
+      </w:r>
+    </w:p>
+    <w:p>
+      <w:pPr>
+        <w:pStyle w:val="ListParagraph"/>
+        <w:keepNext/>
+        <w:numPr>
+          <w:ilvl w:val="0"/>
+          <w:numId w:val="1"/>
+        </w:numPr>
+        <w:spacing w:after="40" w:before="0"/>
+        <w:ind w:left="288"/>
+      </w:pPr>
+      <w:hyperlink w:history="1" r:id="rIdssr1yqvciqizgxf2eni2x">
+        <w:r>
+          <w:rPr>
+            <w:rFonts w:ascii="DM Sans" w:cs="DM Sans" w:eastAsia="DM Sans" w:hAnsi="DM Sans"/>
+            <w:b w:val="false"/>
+            <w:bCs w:val="false"/>
+            <w:i w:val="false"/>
+            <w:iCs w:val="false"/>
+            <w:color w:val="000000"/>
+            <w:sz w:val="21"/>
+            <w:szCs w:val="21"/>
+            <w:u w:val="single" w:color="000000"/>
+          </w:rPr>
+          <w:t xml:space="preserve">Artist Growth</w:t>
+        </w:r>
+      </w:hyperlink>
+      <w:r>
+        <w:rPr>
+          <w:rFonts w:ascii="DM Sans" w:cs="DM Sans" w:eastAsia="DM Sans" w:hAnsi="DM Sans"/>
+          <w:b w:val="false"/>
+          <w:bCs w:val="false"/>
+          <w:i w:val="false"/>
+          <w:iCs w:val="false"/>
+          <w:color w:val="000000"/>
+          <w:sz w:val="21"/>
+          <w:szCs w:val="21"/>
+        </w:rPr>
+        <w:t xml:space="preserve"> (2022, music-industry SaaS): drafted user stories and product requirement documents for web and mobile applications</w:t>
+      </w:r>
+    </w:p>
+    <w:p>
+      <w:pPr>
+        <w:pStyle w:val="ListParagraph"/>
+        <w:keepNext/>
+        <w:numPr>
+          <w:ilvl w:val="0"/>
+          <w:numId w:val="1"/>
+        </w:numPr>
+        <w:spacing w:after="40" w:before="0"/>
+        <w:ind w:left="288"/>
+      </w:pPr>
+      <w:r>
+        <w:rPr>
+          <w:rFonts w:ascii="DM Sans" w:cs="DM Sans" w:eastAsia="DM Sans" w:hAnsi="DM Sans"/>
+          <w:b w:val="false"/>
+          <w:bCs w:val="false"/>
+          <w:i w:val="false"/>
+          <w:iCs w:val="false"/>
+          <w:color w:val="000000"/>
+          <w:sz w:val="21"/>
+          <w:szCs w:val="21"/>
+        </w:rPr>
+        <w:t xml:space="preserve">Launched feature request and bug report processes via integrations with Asana and Slack</w:t>
+      </w:r>
+    </w:p>
+    <w:p>
+      <w:pPr>
+        <w:pStyle w:val="ListParagraph"/>
+        <w:keepNext/>
+        <w:numPr>
+          <w:ilvl w:val="0"/>
+          <w:numId w:val="1"/>
+        </w:numPr>
+        <w:spacing w:after="40" w:before="0"/>
+        <w:ind w:left="288"/>
+      </w:pPr>
+      <w:r>
+        <w:rPr>
+          <w:rFonts w:ascii="DM Sans" w:cs="DM Sans" w:eastAsia="DM Sans" w:hAnsi="DM Sans"/>
+          <w:b w:val="false"/>
+          <w:bCs w:val="false"/>
+          <w:i w:val="false"/>
+          <w:iCs w:val="false"/>
+          <w:color w:val="000000"/>
+          <w:sz w:val="21"/>
+          <w:szCs w:val="21"/>
+        </w:rPr>
+        <w:t xml:space="preserve">Performed heuristic analysis of marketing site and presented findings to leadership team</w:t>
+      </w:r>
+    </w:p>
+    <w:p>
+      <w:pPr>
+        <w:pStyle w:val="ListParagraph"/>
+        <w:keepNext/>
+        <w:numPr>
+          <w:ilvl w:val="0"/>
+          <w:numId w:val="1"/>
+        </w:numPr>
+        <w:spacing w:after="40" w:before="0"/>
+        <w:ind w:left="288"/>
+      </w:pPr>
+      <w:r>
+        <w:rPr>
+          <w:rFonts w:ascii="DM Sans" w:cs="DM Sans" w:eastAsia="DM Sans" w:hAnsi="DM Sans"/>
+          <w:b w:val="false"/>
+          <w:bCs w:val="false"/>
+          <w:i w:val="false"/>
+          <w:iCs w:val="false"/>
+          <w:color w:val="000000"/>
+          <w:sz w:val="21"/>
+          <w:szCs w:val="21"/>
+        </w:rPr>
+        <w:t xml:space="preserve">Prospected various tools for the organization, and procured Productboard, Mode, Mixpanel</w:t>
+      </w:r>
+    </w:p>
+    <w:p>
+      <w:pPr>
+        <w:pStyle w:val="ListParagraph"/>
+        <w:numPr>
+          <w:ilvl w:val="0"/>
+          <w:numId w:val="1"/>
+        </w:numPr>
+        <w:spacing w:after="40" w:before="0"/>
+        <w:ind w:left="288"/>
+      </w:pPr>
+      <w:r>
+        <w:rPr>
+          <w:rFonts w:ascii="DM Sans" w:cs="DM Sans" w:eastAsia="DM Sans" w:hAnsi="DM Sans"/>
+          <w:b w:val="false"/>
+          <w:bCs w:val="false"/>
+          <w:i w:val="false"/>
+          <w:iCs w:val="false"/>
+          <w:color w:val="000000"/>
+          <w:sz w:val="21"/>
+          <w:szCs w:val="21"/>
+        </w:rPr>
+        <w:t xml:space="preserve">Initiated organization-wide investigation to achieve GDPR and CCPA compliance</w:t>
       </w:r>
     </w:p>
     <w:p>
@@ -313,7 +650,7 @@
         <w:keepNext/>
         <w:spacing w:after="0" w:before="200"/>
       </w:pPr>
-      <w:hyperlink w:history="1" r:id="rId--hvbaxuwfmcwrvlhf9tw">
+      <w:hyperlink w:history="1" r:id="rId8w-xmlmgpcmrzeyqhjtf-">
         <w:r>
           <w:rPr>
             <w:rFonts w:ascii="DM Sans" w:cs="DM Sans" w:eastAsia="DM Sans" w:hAnsi="DM Sans"/>
@@ -932,7 +1269,7 @@
         <w:keepNext/>
         <w:spacing w:after="0" w:before="200"/>
       </w:pPr>
-      <w:hyperlink w:history="1" r:id="rIdnyetkeiw5abuaxba760jy">
+      <w:hyperlink w:history="1" r:id="rIda_go4hi5hqhldwrulcd_s">
         <w:r>
           <w:rPr>
             <w:rFonts w:ascii="DM Sans" w:cs="DM Sans" w:eastAsia="DM Sans" w:hAnsi="DM Sans"/>
@@ -978,7 +1315,7 @@
           <w:sz w:val="21"/>
           <w:szCs w:val="21"/>
         </w:rPr>
-        <w:t xml:space="preserve">Technical Product Manager, Content, Data Ingestion</w:t>
+        <w:t xml:space="preserve">Technical Product Manager, Content and Data Ingestion</w:t>
       </w:r>
       <w:r>
         <w:rPr>
@@ -1462,339 +1799,7 @@
         <w:keepNext/>
         <w:spacing w:after="0" w:before="200"/>
       </w:pPr>
-      <w:r>
-        <w:rPr>
-          <w:rFonts w:ascii="DM Sans" w:cs="DM Sans" w:eastAsia="DM Sans" w:hAnsi="DM Sans"/>
-          <w:b/>
-          <w:bCs/>
-          <w:i w:val="false"/>
-          <w:iCs w:val="false"/>
-          <w:color w:val="000000"/>
-          <w:sz w:val="24"/>
-          <w:szCs w:val="24"/>
-        </w:rPr>
-        <w:t xml:space="preserve">Freelance</w:t>
-      </w:r>
-    </w:p>
-    <w:p>
-      <w:pPr>
-        <w:keepNext/>
-        <w:spacing w:after="60" w:before="0"/>
-      </w:pPr>
-      <w:r>
-        <w:rPr>
-          <w:rFonts w:ascii="DM Sans" w:cs="DM Sans" w:eastAsia="DM Sans" w:hAnsi="DM Sans"/>
-          <w:b/>
-          <w:bCs/>
-          <w:i w:val="false"/>
-          <w:iCs w:val="false"/>
-          <w:color w:val="000000"/>
-          <w:sz w:val="21"/>
-          <w:szCs w:val="21"/>
-        </w:rPr>
-        <w:t xml:space="preserve">Consultant</w:t>
-      </w:r>
-      <w:r>
-        <w:rPr>
-          <w:rFonts w:ascii="DM Sans" w:cs="DM Sans" w:eastAsia="DM Sans" w:hAnsi="DM Sans"/>
-          <w:b w:val="false"/>
-          <w:bCs w:val="false"/>
-          <w:i w:val="false"/>
-          <w:iCs w:val="false"/>
-          <w:color w:val="000000"/>
-          <w:sz w:val="21"/>
-          <w:szCs w:val="21"/>
-        </w:rPr>
-        <w:t xml:space="preserve"> — Aug 2022 – Oct 2022</w:t>
-      </w:r>
-    </w:p>
-    <w:p>
-      <w:pPr>
-        <w:pStyle w:val="ListParagraph"/>
-        <w:keepNext/>
-        <w:numPr>
-          <w:ilvl w:val="0"/>
-          <w:numId w:val="1"/>
-        </w:numPr>
-        <w:spacing w:after="40" w:before="0"/>
-        <w:ind w:left="288"/>
-      </w:pPr>
-      <w:r>
-        <w:rPr>
-          <w:rFonts w:ascii="DM Sans" w:cs="DM Sans" w:eastAsia="DM Sans" w:hAnsi="DM Sans"/>
-          <w:b w:val="false"/>
-          <w:bCs w:val="false"/>
-          <w:i w:val="false"/>
-          <w:iCs w:val="false"/>
-          <w:color w:val="000000"/>
-          <w:sz w:val="21"/>
-          <w:szCs w:val="21"/>
-        </w:rPr>
-        <w:t xml:space="preserve">Created content marketing strategy for </w:t>
-      </w:r>
-      <w:hyperlink w:history="1" r:id="rIdgrjkd2zgkpk5fcsokr1yc">
-        <w:r>
-          <w:rPr>
-            <w:rFonts w:ascii="DM Sans" w:cs="DM Sans" w:eastAsia="DM Sans" w:hAnsi="DM Sans"/>
-            <w:b w:val="false"/>
-            <w:bCs w:val="false"/>
-            <w:i w:val="false"/>
-            <w:iCs w:val="false"/>
-            <w:color w:val="000000"/>
-            <w:sz w:val="21"/>
-            <w:szCs w:val="21"/>
-            <w:u w:val="single" w:color="000000"/>
-          </w:rPr>
-          <w:t xml:space="preserve">New England Foundation for the Arts</w:t>
-        </w:r>
-      </w:hyperlink>
-    </w:p>
-    <w:p>
-      <w:pPr>
-        <w:pStyle w:val="ListParagraph"/>
-        <w:keepNext/>
-        <w:numPr>
-          <w:ilvl w:val="0"/>
-          <w:numId w:val="1"/>
-        </w:numPr>
-        <w:spacing w:after="40" w:before="0"/>
-        <w:ind w:left="288"/>
-      </w:pPr>
-      <w:r>
-        <w:rPr>
-          <w:rFonts w:ascii="DM Sans" w:cs="DM Sans" w:eastAsia="DM Sans" w:hAnsi="DM Sans"/>
-          <w:b w:val="false"/>
-          <w:bCs w:val="false"/>
-          <w:i w:val="false"/>
-          <w:iCs w:val="false"/>
-          <w:color w:val="000000"/>
-          <w:sz w:val="21"/>
-          <w:szCs w:val="21"/>
-        </w:rPr>
-        <w:t xml:space="preserve">Developed analytics system architecture, data strategy, and dashboards for a private client</w:t>
-      </w:r>
-    </w:p>
-    <w:p>
-      <w:pPr>
-        <w:pStyle w:val="ListParagraph"/>
-        <w:numPr>
-          <w:ilvl w:val="0"/>
-          <w:numId w:val="1"/>
-        </w:numPr>
-        <w:spacing w:after="40" w:before="0"/>
-        <w:ind w:left="288"/>
-      </w:pPr>
-      <w:r>
-        <w:rPr>
-          <w:rFonts w:ascii="DM Sans" w:cs="DM Sans" w:eastAsia="DM Sans" w:hAnsi="DM Sans"/>
-          <w:b w:val="false"/>
-          <w:bCs w:val="false"/>
-          <w:i w:val="false"/>
-          <w:iCs w:val="false"/>
-          <w:color w:val="000000"/>
-          <w:sz w:val="21"/>
-          <w:szCs w:val="21"/>
-        </w:rPr>
-        <w:t xml:space="preserve">Leveraged PM expertise to provide holistic consultation on specific business operations</w:t>
-      </w:r>
-    </w:p>
-    <w:p>
-      <w:pPr>
-        <w:keepNext/>
-        <w:spacing w:after="0" w:before="200"/>
-      </w:pPr>
-      <w:hyperlink w:history="1" r:id="rIdmlb6d-btgi34hevplmmcj">
-        <w:r>
-          <w:rPr>
-            <w:rFonts w:ascii="DM Sans" w:cs="DM Sans" w:eastAsia="DM Sans" w:hAnsi="DM Sans"/>
-            <w:b/>
-            <w:bCs/>
-            <w:i w:val="false"/>
-            <w:iCs w:val="false"/>
-            <w:color w:val="000000"/>
-            <w:sz w:val="24"/>
-            <w:szCs w:val="24"/>
-            <w:u w:val="single" w:color="000000"/>
-          </w:rPr>
-          <w:t xml:space="preserve">Artist Growth</w:t>
-        </w:r>
-      </w:hyperlink>
-      <w:r>
-        <w:rPr>
-          <w:rFonts w:ascii="DM Sans" w:cs="DM Sans" w:eastAsia="DM Sans" w:hAnsi="DM Sans"/>
-          <w:b w:val="false"/>
-          <w:bCs w:val="false"/>
-          <w:i w:val="false"/>
-          <w:iCs w:val="false"/>
-          <w:color w:val="000000"/>
-          <w:sz w:val="24"/>
-          <w:szCs w:val="24"/>
-        </w:rPr>
-        <w:t xml:space="preserve"> — Remote</w:t>
-      </w:r>
-    </w:p>
-    <w:p>
-      <w:pPr>
-        <w:keepNext/>
-        <w:spacing w:after="60" w:before="0"/>
-      </w:pPr>
-      <w:r>
-        <w:rPr>
-          <w:rFonts w:ascii="DM Sans" w:cs="DM Sans" w:eastAsia="DM Sans" w:hAnsi="DM Sans"/>
-          <w:b/>
-          <w:bCs/>
-          <w:i w:val="false"/>
-          <w:iCs w:val="false"/>
-          <w:color w:val="000000"/>
-          <w:sz w:val="21"/>
-          <w:szCs w:val="21"/>
-        </w:rPr>
-        <w:t xml:space="preserve">Product Manager</w:t>
-      </w:r>
-      <w:r>
-        <w:rPr>
-          <w:rFonts w:ascii="DM Sans" w:cs="DM Sans" w:eastAsia="DM Sans" w:hAnsi="DM Sans"/>
-          <w:b w:val="false"/>
-          <w:bCs w:val="false"/>
-          <w:i w:val="false"/>
-          <w:iCs w:val="false"/>
-          <w:color w:val="000000"/>
-          <w:sz w:val="21"/>
-          <w:szCs w:val="21"/>
-        </w:rPr>
-        <w:t xml:space="preserve"> — Mar 2022 – May 2022</w:t>
-      </w:r>
-    </w:p>
-    <w:p>
-      <w:pPr>
-        <w:pStyle w:val="ListParagraph"/>
-        <w:keepNext/>
-        <w:numPr>
-          <w:ilvl w:val="0"/>
-          <w:numId w:val="1"/>
-        </w:numPr>
-        <w:spacing w:after="40" w:before="0"/>
-        <w:ind w:left="288"/>
-      </w:pPr>
-      <w:r>
-        <w:rPr>
-          <w:rFonts w:ascii="DM Sans" w:cs="DM Sans" w:eastAsia="DM Sans" w:hAnsi="DM Sans"/>
-          <w:b w:val="false"/>
-          <w:bCs w:val="false"/>
-          <w:i w:val="false"/>
-          <w:iCs w:val="false"/>
-          <w:color w:val="000000"/>
-          <w:sz w:val="21"/>
-          <w:szCs w:val="21"/>
-        </w:rPr>
-        <w:t xml:space="preserve">Drafted user stories and product requirement documents for web and mobile applications</w:t>
-      </w:r>
-    </w:p>
-    <w:p>
-      <w:pPr>
-        <w:pStyle w:val="ListParagraph"/>
-        <w:keepNext/>
-        <w:numPr>
-          <w:ilvl w:val="0"/>
-          <w:numId w:val="1"/>
-        </w:numPr>
-        <w:spacing w:after="40" w:before="0"/>
-        <w:ind w:left="288"/>
-      </w:pPr>
-      <w:r>
-        <w:rPr>
-          <w:rFonts w:ascii="DM Sans" w:cs="DM Sans" w:eastAsia="DM Sans" w:hAnsi="DM Sans"/>
-          <w:b w:val="false"/>
-          <w:bCs w:val="false"/>
-          <w:i w:val="false"/>
-          <w:iCs w:val="false"/>
-          <w:color w:val="000000"/>
-          <w:sz w:val="21"/>
-          <w:szCs w:val="21"/>
-        </w:rPr>
-        <w:t xml:space="preserve">Launched feature request and bug report processes via integrations with Asana and Slack</w:t>
-      </w:r>
-    </w:p>
-    <w:p>
-      <w:pPr>
-        <w:pStyle w:val="ListParagraph"/>
-        <w:keepNext/>
-        <w:numPr>
-          <w:ilvl w:val="0"/>
-          <w:numId w:val="1"/>
-        </w:numPr>
-        <w:spacing w:after="40" w:before="0"/>
-        <w:ind w:left="288"/>
-      </w:pPr>
-      <w:r>
-        <w:rPr>
-          <w:rFonts w:ascii="DM Sans" w:cs="DM Sans" w:eastAsia="DM Sans" w:hAnsi="DM Sans"/>
-          <w:b w:val="false"/>
-          <w:bCs w:val="false"/>
-          <w:i w:val="false"/>
-          <w:iCs w:val="false"/>
-          <w:color w:val="000000"/>
-          <w:sz w:val="21"/>
-          <w:szCs w:val="21"/>
-        </w:rPr>
-        <w:t xml:space="preserve">Performed heuristic analysis of marketing site and presented findings to leadership team</w:t>
-      </w:r>
-    </w:p>
-    <w:p>
-      <w:pPr>
-        <w:pStyle w:val="ListParagraph"/>
-        <w:keepNext/>
-        <w:numPr>
-          <w:ilvl w:val="0"/>
-          <w:numId w:val="1"/>
-        </w:numPr>
-        <w:spacing w:after="40" w:before="0"/>
-        <w:ind w:left="288"/>
-      </w:pPr>
-      <w:r>
-        <w:rPr>
-          <w:rFonts w:ascii="DM Sans" w:cs="DM Sans" w:eastAsia="DM Sans" w:hAnsi="DM Sans"/>
-          <w:b w:val="false"/>
-          <w:bCs w:val="false"/>
-          <w:i w:val="false"/>
-          <w:iCs w:val="false"/>
-          <w:color w:val="000000"/>
-          <w:sz w:val="21"/>
-          <w:szCs w:val="21"/>
-        </w:rPr>
-        <w:t xml:space="preserve">Prospected various tools for the organization, and procured Productboard, Mode, Mixpanel</w:t>
-      </w:r>
-    </w:p>
-    <w:p>
-      <w:pPr>
-        <w:pStyle w:val="ListParagraph"/>
-        <w:numPr>
-          <w:ilvl w:val="0"/>
-          <w:numId w:val="1"/>
-        </w:numPr>
-        <w:spacing w:after="40" w:before="0"/>
-        <w:ind w:left="288"/>
-      </w:pPr>
-      <w:r>
-        <w:rPr>
-          <w:rFonts w:ascii="DM Sans" w:cs="DM Sans" w:eastAsia="DM Sans" w:hAnsi="DM Sans"/>
-          <w:b w:val="false"/>
-          <w:bCs w:val="false"/>
-          <w:i w:val="false"/>
-          <w:iCs w:val="false"/>
-          <w:color w:val="000000"/>
-          <w:sz w:val="21"/>
-          <w:szCs w:val="21"/>
-        </w:rPr>
-        <w:t xml:space="preserve">Initiated organization-wide investigation to achieve GDPR and CCPA compliance</w:t>
-      </w:r>
-    </w:p>
-    <w:p>
-      <w:pPr>
-        <w:keepNext/>
-        <w:spacing w:after="0" w:before="200"/>
-      </w:pPr>
-      <w:hyperlink w:history="1" r:id="rIdlf3kuh_tn_csgl2ws-5wg">
+      <w:hyperlink w:history="1" r:id="rIdy4hytgkng4sxmkuiq4ul6">
         <w:r>
           <w:rPr>
             <w:rFonts w:ascii="DM Sans" w:cs="DM Sans" w:eastAsia="DM Sans" w:hAnsi="DM Sans"/>
@@ -2111,7 +2116,7 @@
         <w:keepNext/>
         <w:spacing w:after="0" w:before="200"/>
       </w:pPr>
-      <w:hyperlink w:history="1" r:id="rIdeues3qxm8_itkyogmetgp">
+      <w:hyperlink w:history="1" r:id="rId76s8dq7stvxtgehxytyha">
         <w:r>
           <w:rPr>
             <w:rFonts w:ascii="DM Sans" w:cs="DM Sans" w:eastAsia="DM Sans" w:hAnsi="DM Sans"/>
@@ -2157,7 +2162,7 @@
           <w:sz w:val="21"/>
           <w:szCs w:val="21"/>
         </w:rPr>
-        <w:t xml:space="preserve">Admissions Lead (Project Manager)</w:t>
+        <w:t xml:space="preserve">Admissions Lead, Project Manager</w:t>
       </w:r>
       <w:r>
         <w:rPr>
@@ -2378,7 +2383,7 @@
         <w:keepNext/>
         <w:spacing w:after="0" w:before="200"/>
       </w:pPr>
-      <w:hyperlink w:history="1" r:id="rIddvm2urk8q62lwez5e1ncg">
+      <w:hyperlink w:history="1" r:id="rIdxeeh8upm2ufhgu5cz0f-z">
         <w:r>
           <w:rPr>
             <w:rFonts w:ascii="DM Sans" w:cs="DM Sans" w:eastAsia="DM Sans" w:hAnsi="DM Sans"/>
@@ -2815,7 +2820,7 @@
         <w:keepNext/>
         <w:spacing w:after="0" w:before="0"/>
       </w:pPr>
-      <w:hyperlink w:history="1" r:id="rId936geb_n1u5fqh68bywwv">
+      <w:hyperlink w:history="1" r:id="rId-ybdgriqwuc8bqw3-cso6">
         <w:r>
           <w:rPr>
             <w:rFonts w:ascii="DM Sans" w:cs="DM Sans" w:eastAsia="DM Sans" w:hAnsi="DM Sans"/>
@@ -2969,7 +2974,7 @@
         <w:keepNext/>
         <w:spacing w:after="0" w:before="200"/>
       </w:pPr>
-      <w:hyperlink w:history="1" r:id="rIdajlln44ef6sic3utz1mwo">
+      <w:hyperlink w:history="1" r:id="rIdndqgf6il6z26psgl3pnqn">
         <w:r>
           <w:rPr>
             <w:rFonts w:ascii="DM Sans" w:cs="DM Sans" w:eastAsia="DM Sans" w:hAnsi="DM Sans"/>
@@ -3098,7 +3103,7 @@
         <w:keepNext/>
         <w:spacing w:after="0" w:before="200"/>
       </w:pPr>
-      <w:hyperlink w:history="1" r:id="rIdo8bipb1dkrxf7j1b1ezr8">
+      <w:hyperlink w:history="1" r:id="rId63oiirnpthruizftb_-ih">
         <w:r>
           <w:rPr>
             <w:rFonts w:ascii="DM Sans" w:cs="DM Sans" w:eastAsia="DM Sans" w:hAnsi="DM Sans"/>
@@ -3309,7 +3314,7 @@
         <w:sz w:val="18"/>
         <w:szCs w:val="18"/>
       </w:rPr>
-      <w:t xml:space="preserve">Senior Product Manager · Growth and Data · Media, Publishing, and Streaming · AI-Native</w:t>
+      <w:t xml:space="preserve">Senior Product Manager · Growth and Data Platform · Media, Publishing, and Streaming · AI-Native</w:t>
     </w:r>
   </w:p>
   <w:p>
@@ -3319,7 +3324,7 @@
       </w:pBdr>
       <w:spacing w:after="80" w:before="40"/>
     </w:pPr>
-    <w:hyperlink w:history="1" r:id="rIdkjr11nlqcb_djcc9ga7-h">
+    <w:hyperlink w:history="1" r:id="rIdwnzzpi_tv515bisffc-_j">
       <w:r>
         <w:rPr>
           <w:rFonts w:ascii="DM Sans" w:cs="DM Sans" w:eastAsia="DM Sans" w:hAnsi="DM Sans"/>
@@ -3344,7 +3349,7 @@
       </w:rPr>
       <w:t xml:space="preserve"> · </w:t>
     </w:r>
-    <w:hyperlink w:history="1" r:id="rIdb2dqijj3f0i11317sew2n">
+    <w:hyperlink w:history="1" r:id="rIdgtxlj7ddmekwsuzr1itnz">
       <w:r>
         <w:rPr>
           <w:rFonts w:ascii="DM Sans" w:cs="DM Sans" w:eastAsia="DM Sans" w:hAnsi="DM Sans"/>
@@ -3369,7 +3374,7 @@
       </w:rPr>
       <w:t xml:space="preserve"> · </w:t>
     </w:r>
-    <w:hyperlink w:history="1" r:id="rIdamrndxp5l0rwk2dr3rz2y">
+    <w:hyperlink w:history="1" r:id="rId6yiy68tjnp-bmvgbtp2e7">
       <w:r>
         <w:rPr>
           <w:rFonts w:ascii="DM Sans" w:cs="DM Sans" w:eastAsia="DM Sans" w:hAnsi="DM Sans"/>

</xml_diff>

<commit_message>
Rebuild the bullet bank from the reframed source
Co-Authored-By: Claude Opus 5 <noreply@anthropic.com>
Claude-Session: https://claude.ai/code/session_011fUZkNUmpHXrNK2AyvguT1
</commit_message>
<xml_diff>
--- a/public/resume/malcolm-xavier-bullet-bank-template.docx
+++ b/public/resume/malcolm-xavier-bullet-bank-template.docx
@@ -40,7 +40,7 @@
       <w:pPr>
         <w:spacing w:after="240" w:before="0"/>
       </w:pPr>
-      <w:hyperlink w:history="1" r:id="rId0lded2bjlgxxz2adjzgwy">
+      <w:hyperlink w:history="1" r:id="rIdcr6teq5uy60nwsdgn_68v">
         <w:r>
           <w:rPr>
             <w:rFonts w:ascii="DM Sans" w:cs="DM Sans" w:eastAsia="DM Sans" w:hAnsi="DM Sans"/>
@@ -69,7 +69,7 @@
         </w:rPr>
         <w:t xml:space="preserve"> · </w:t>
       </w:r>
-      <w:hyperlink w:history="1" r:id="rIdyippmvfwyneeckqnvb3ib">
+      <w:hyperlink w:history="1" r:id="rId4gdrvt1cxrryt9kovzywo">
         <w:r>
           <w:rPr>
             <w:rFonts w:ascii="DM Sans" w:cs="DM Sans" w:eastAsia="DM Sans" w:hAnsi="DM Sans"/>
@@ -98,7 +98,7 @@
         </w:rPr>
         <w:t xml:space="preserve"> · </w:t>
       </w:r>
-      <w:hyperlink w:history="1" r:id="rId_4yjyjh9rgyike-qtx_fh">
+      <w:hyperlink w:history="1" r:id="rId3uhwk81bnzfpyx2ewaynz">
         <w:r>
           <w:rPr>
             <w:rFonts w:ascii="DM Sans" w:cs="DM Sans" w:eastAsia="DM Sans" w:hAnsi="DM Sans"/>
@@ -156,7 +156,7 @@
           <w:sz w:val="21"/>
           <w:szCs w:val="21"/>
         </w:rPr>
-        <w:t xml:space="preserve">Senior Product Manager with 7+ years scaling growth, marketing, and data platforms in media, publishing, and B2B SaaS. Built and operated MarTech infrastructure for 22M+ users across 40+ brands, driving 33% YoY email revenue growth. Applied an MS in Law (focused on data privacy and IP) to data governance and compliance-related roadmap tradeoffs. Architects AI-native discovery and delivery loops—roadmapping, outcome measurement, and documentation.</w:t>
+        <w:t xml:space="preserve">Senior Product Manager with 7+ years scaling growth, marketing, and data platforms in media, publishing, and B2B SaaS. Built and operated MarTech infrastructure for 22M+ users across 40+ brands, driving 33% YoY email revenue growth. Applied an MS in Law (focused on data privacy and IP) to data governance and compliance-related roadmap tradeoffs. Architects AI-native discovery and delivery loops, with three years of hands-on LLM and agent training and evaluation.</w:t>
       </w:r>
     </w:p>
     <w:p>
@@ -266,21 +266,75 @@
           <w:sz w:val="21"/>
           <w:szCs w:val="21"/>
         </w:rPr>
-        <w:t xml:space="preserve">Build and operate my own products—malxavi.com and the editorial operation behind my published writing—on an AI-native setup, with agentic workflows in the loop from roadmap to ship</w:t>
-      </w:r>
-    </w:p>
-    <w:p>
-      <w:pPr>
-        <w:pStyle w:val="ListParagraph"/>
-        <w:keepNext/>
-        <w:numPr>
-          <w:ilvl w:val="0"/>
-          <w:numId w:val="1"/>
-        </w:numPr>
-        <w:spacing w:after="40" w:before="0"/>
-        <w:ind w:left="288"/>
-      </w:pPr>
-      <w:hyperlink w:history="1" r:id="rId_s-oseotgo7ntaozkb3dh">
+        <w:t xml:space="preserve">Build and operate </w:t>
+      </w:r>
+      <w:hyperlink w:history="1" r:id="rId2toysmallkva33ep0bojx">
+        <w:r>
+          <w:rPr>
+            <w:rFonts w:ascii="DM Sans" w:cs="DM Sans" w:eastAsia="DM Sans" w:hAnsi="DM Sans"/>
+            <w:b w:val="false"/>
+            <w:bCs w:val="false"/>
+            <w:i w:val="false"/>
+            <w:iCs w:val="false"/>
+            <w:color w:val="000000"/>
+            <w:sz w:val="21"/>
+            <w:szCs w:val="21"/>
+            <w:u w:val="single" w:color="000000"/>
+          </w:rPr>
+          <w:t xml:space="preserve">The Booth</w:t>
+        </w:r>
+      </w:hyperlink>
+      <w:r>
+        <w:rPr>
+          <w:rFonts w:ascii="DM Sans" w:cs="DM Sans" w:eastAsia="DM Sans" w:hAnsi="DM Sans"/>
+          <w:b w:val="false"/>
+          <w:bCs w:val="false"/>
+          <w:i w:val="false"/>
+          <w:iCs w:val="false"/>
+          <w:color w:val="000000"/>
+          <w:sz w:val="21"/>
+          <w:szCs w:val="21"/>
+        </w:rPr>
+        <w:t xml:space="preserve"> on Claude Code, the AI-native system I plan and ship my own work from: one prioritized day across six workstreams, agents that run unattended on a schedule, and every automated write logged and reversible</w:t>
+      </w:r>
+    </w:p>
+    <w:p>
+      <w:pPr>
+        <w:pStyle w:val="ListParagraph"/>
+        <w:keepNext/>
+        <w:numPr>
+          <w:ilvl w:val="0"/>
+          <w:numId w:val="1"/>
+        </w:numPr>
+        <w:spacing w:after="40" w:before="0"/>
+        <w:ind w:left="288"/>
+      </w:pPr>
+      <w:r>
+        <w:rPr>
+          <w:rFonts w:ascii="DM Sans" w:cs="DM Sans" w:eastAsia="DM Sans" w:hAnsi="DM Sans"/>
+          <w:b w:val="false"/>
+          <w:bCs w:val="false"/>
+          <w:i w:val="false"/>
+          <w:iCs w:val="false"/>
+          <w:color w:val="000000"/>
+          <w:sz w:val="21"/>
+          <w:szCs w:val="21"/>
+        </w:rPr>
+        <w:t xml:space="preserve">Set the privacy rules for The Booth's automation: the jobs that can reach the internet can't reach personal data</w:t>
+      </w:r>
+    </w:p>
+    <w:p>
+      <w:pPr>
+        <w:pStyle w:val="ListParagraph"/>
+        <w:keepNext/>
+        <w:numPr>
+          <w:ilvl w:val="0"/>
+          <w:numId w:val="1"/>
+        </w:numPr>
+        <w:spacing w:after="40" w:before="0"/>
+        <w:ind w:left="288"/>
+      </w:pPr>
+      <w:hyperlink w:history="1" r:id="rIdk-j4ero5_j5sipywhiwpu">
         <w:r>
           <w:rPr>
             <w:rFonts w:ascii="DM Sans" w:cs="DM Sans" w:eastAsia="DM Sans" w:hAnsi="DM Sans"/>
@@ -307,21 +361,21 @@
           <w:sz w:val="21"/>
           <w:szCs w:val="21"/>
         </w:rPr>
-        <w:t xml:space="preserve"> (2026–present): AI training and evaluation—prompting techniques, evaluation rubrics, and agent-behavior assessment for simulated-environment research</w:t>
-      </w:r>
-    </w:p>
-    <w:p>
-      <w:pPr>
-        <w:pStyle w:val="ListParagraph"/>
-        <w:keepNext/>
-        <w:numPr>
-          <w:ilvl w:val="0"/>
-          <w:numId w:val="1"/>
-        </w:numPr>
-        <w:spacing w:after="40" w:before="0"/>
-        <w:ind w:left="288"/>
-      </w:pPr>
-      <w:hyperlink w:history="1" r:id="rIdukreqigx74t6j9hag3if3">
+        <w:t xml:space="preserve"> (2026–present): AI training data—prompt development and change-logged sessions in simulated environments</w:t>
+      </w:r>
+    </w:p>
+    <w:p>
+      <w:pPr>
+        <w:pStyle w:val="ListParagraph"/>
+        <w:keepNext/>
+        <w:numPr>
+          <w:ilvl w:val="0"/>
+          <w:numId w:val="1"/>
+        </w:numPr>
+        <w:spacing w:after="40" w:before="0"/>
+        <w:ind w:left="288"/>
+      </w:pPr>
+      <w:hyperlink w:history="1" r:id="rIdz1uuie3h4w1z4ohbr6b-q">
         <w:r>
           <w:rPr>
             <w:rFonts w:ascii="DM Sans" w:cs="DM Sans" w:eastAsia="DM Sans" w:hAnsi="DM Sans"/>
@@ -348,6 +402,47 @@
           <w:sz w:val="21"/>
           <w:szCs w:val="21"/>
         </w:rPr>
+        <w:t xml:space="preserve"> (2023–2026): LLM and agent evaluation—prompts, including adversarial ones, plus criteria, rubrics, response grading, and peer review</w:t>
+      </w:r>
+    </w:p>
+    <w:p>
+      <w:pPr>
+        <w:pStyle w:val="ListParagraph"/>
+        <w:keepNext/>
+        <w:numPr>
+          <w:ilvl w:val="0"/>
+          <w:numId w:val="1"/>
+        </w:numPr>
+        <w:spacing w:after="40" w:before="0"/>
+        <w:ind w:left="288"/>
+      </w:pPr>
+      <w:hyperlink w:history="1" r:id="rIdc1ov5yznekrs6j8f97qbu">
+        <w:r>
+          <w:rPr>
+            <w:rFonts w:ascii="DM Sans" w:cs="DM Sans" w:eastAsia="DM Sans" w:hAnsi="DM Sans"/>
+            <w:b w:val="false"/>
+            <w:bCs w:val="false"/>
+            <w:i w:val="false"/>
+            <w:iCs w:val="false"/>
+            <w:color w:val="000000"/>
+            <w:sz w:val="21"/>
+            <w:szCs w:val="21"/>
+            <w:u w:val="single" w:color="000000"/>
+          </w:rPr>
+          <w:t xml:space="preserve">DataAnnotation</w:t>
+        </w:r>
+      </w:hyperlink>
+      <w:r>
+        <w:rPr>
+          <w:rFonts w:ascii="DM Sans" w:cs="DM Sans" w:eastAsia="DM Sans" w:hAnsi="DM Sans"/>
+          <w:b w:val="false"/>
+          <w:bCs w:val="false"/>
+          <w:i w:val="false"/>
+          <w:iCs w:val="false"/>
+          <w:color w:val="000000"/>
+          <w:sz w:val="21"/>
+          <w:szCs w:val="21"/>
+        </w:rPr>
         <w:t xml:space="preserve"> (2023–2026): trained LLM models (GPT-5, Gemini 2.5 Pro, etc.) across various agentic and RAG use cases</w:t>
       </w:r>
     </w:p>
@@ -425,7 +520,7 @@
         </w:rPr>
         <w:t xml:space="preserve">Created content marketing strategy for </w:t>
       </w:r>
-      <w:hyperlink w:history="1" r:id="rIdub6otlsyfd-uw53lxtbvv">
+      <w:hyperlink w:history="1" r:id="rIdmgidsc2iqcv5y6lfxaajm">
         <w:r>
           <w:rPr>
             <w:rFonts w:ascii="DM Sans" w:cs="DM Sans" w:eastAsia="DM Sans" w:hAnsi="DM Sans"/>
@@ -516,7 +611,7 @@
         <w:spacing w:after="40" w:before="0"/>
         <w:ind w:left="288"/>
       </w:pPr>
-      <w:hyperlink w:history="1" r:id="rId_zt3xub02qx_oxe1yighl">
+      <w:hyperlink w:history="1" r:id="rIdpnnlck9rrewqwrlxx8xl-">
         <w:r>
           <w:rPr>
             <w:rFonts w:ascii="DM Sans" w:cs="DM Sans" w:eastAsia="DM Sans" w:hAnsi="DM Sans"/>
@@ -650,7 +745,7 @@
         <w:keepNext/>
         <w:spacing w:after="0" w:before="200"/>
       </w:pPr>
-      <w:hyperlink w:history="1" r:id="rIdjilze65yh3tc5tkahglsv">
+      <w:hyperlink w:history="1" r:id="rIdud9dsqfz5i5_sh4p2ohmv">
         <w:r>
           <w:rPr>
             <w:rFonts w:ascii="DM Sans" w:cs="DM Sans" w:eastAsia="DM Sans" w:hAnsi="DM Sans"/>
@@ -1269,7 +1364,7 @@
         <w:keepNext/>
         <w:spacing w:after="0" w:before="200"/>
       </w:pPr>
-      <w:hyperlink w:history="1" r:id="rIduoxcaebhlfuqcgvnc4zu3">
+      <w:hyperlink w:history="1" r:id="rIdns2f0ludpm3bwkwee3syl">
         <w:r>
           <w:rPr>
             <w:rFonts w:ascii="DM Sans" w:cs="DM Sans" w:eastAsia="DM Sans" w:hAnsi="DM Sans"/>
@@ -1799,7 +1894,7 @@
         <w:keepNext/>
         <w:spacing w:after="0" w:before="200"/>
       </w:pPr>
-      <w:hyperlink w:history="1" r:id="rIdu1tkaz42v8sh533cn22i9">
+      <w:hyperlink w:history="1" r:id="rIdax-2srvm3jap2qcpq-_-v">
         <w:r>
           <w:rPr>
             <w:rFonts w:ascii="DM Sans" w:cs="DM Sans" w:eastAsia="DM Sans" w:hAnsi="DM Sans"/>
@@ -2116,7 +2211,7 @@
         <w:keepNext/>
         <w:spacing w:after="0" w:before="200"/>
       </w:pPr>
-      <w:hyperlink w:history="1" r:id="rIdbwvjqj-ggqpk8aroencgw">
+      <w:hyperlink w:history="1" r:id="rIdrlj-beykuoxpd8ulubxpe">
         <w:r>
           <w:rPr>
             <w:rFonts w:ascii="DM Sans" w:cs="DM Sans" w:eastAsia="DM Sans" w:hAnsi="DM Sans"/>
@@ -2383,7 +2478,7 @@
         <w:keepNext/>
         <w:spacing w:after="0" w:before="200"/>
       </w:pPr>
-      <w:hyperlink w:history="1" r:id="rIdcvp2vw_alpp_tzbnpqv_w">
+      <w:hyperlink w:history="1" r:id="rIdijtgttkflcoqsjpe0wcll">
         <w:r>
           <w:rPr>
             <w:rFonts w:ascii="DM Sans" w:cs="DM Sans" w:eastAsia="DM Sans" w:hAnsi="DM Sans"/>
@@ -2820,7 +2915,7 @@
         <w:keepNext/>
         <w:spacing w:after="0" w:before="0"/>
       </w:pPr>
-      <w:hyperlink w:history="1" r:id="rId-blq0dxh5lhuqho3wnqsg">
+      <w:hyperlink w:history="1" r:id="rIdml95pap7ynv-88swlola3">
         <w:r>
           <w:rPr>
             <w:rFonts w:ascii="DM Sans" w:cs="DM Sans" w:eastAsia="DM Sans" w:hAnsi="DM Sans"/>
@@ -2974,7 +3069,7 @@
         <w:keepNext/>
         <w:spacing w:after="0" w:before="200"/>
       </w:pPr>
-      <w:hyperlink w:history="1" r:id="rIdeqi-mifwdlshb8ieof2ec">
+      <w:hyperlink w:history="1" r:id="rIdp3a9g1umuk0xljpsdowrn">
         <w:r>
           <w:rPr>
             <w:rFonts w:ascii="DM Sans" w:cs="DM Sans" w:eastAsia="DM Sans" w:hAnsi="DM Sans"/>
@@ -3103,7 +3198,7 @@
         <w:keepNext/>
         <w:spacing w:after="0" w:before="200"/>
       </w:pPr>
-      <w:hyperlink w:history="1" r:id="rIdzrg2i3kc1xqu-9a_qfqgo">
+      <w:hyperlink w:history="1" r:id="rIdnx_w4tavpckhsgrbnpl7n">
         <w:r>
           <w:rPr>
             <w:rFonts w:ascii="DM Sans" w:cs="DM Sans" w:eastAsia="DM Sans" w:hAnsi="DM Sans"/>
@@ -3324,7 +3419,7 @@
       </w:pBdr>
       <w:spacing w:after="80" w:before="40"/>
     </w:pPr>
-    <w:hyperlink w:history="1" r:id="rIdlq3fkrljlsx0e6kbcklt_">
+    <w:hyperlink w:history="1" r:id="rIdpt0101q-rvx57jwrwvook">
       <w:r>
         <w:rPr>
           <w:rFonts w:ascii="DM Sans" w:cs="DM Sans" w:eastAsia="DM Sans" w:hAnsi="DM Sans"/>
@@ -3349,7 +3444,7 @@
       </w:rPr>
       <w:t xml:space="preserve"> · </w:t>
     </w:r>
-    <w:hyperlink w:history="1" r:id="rIdusbd56fxzadsvmh41h3zl">
+    <w:hyperlink w:history="1" r:id="rIdy-pz0dpxdkg5sc9riln0i">
       <w:r>
         <w:rPr>
           <w:rFonts w:ascii="DM Sans" w:cs="DM Sans" w:eastAsia="DM Sans" w:hAnsi="DM Sans"/>
@@ -3374,7 +3469,7 @@
       </w:rPr>
       <w:t xml:space="preserve"> · </w:t>
     </w:r>
-    <w:hyperlink w:history="1" r:id="rIdgthi-uoptlze1zsos35z-">
+    <w:hyperlink w:history="1" r:id="rId8cgahtjziwrccbu_qrv_k">
       <w:r>
         <w:rPr>
           <w:rFonts w:ascii="DM Sans" w:cs="DM Sans" w:eastAsia="DM Sans" w:hAnsi="DM Sans"/>

</xml_diff>

<commit_message>
Shorten the résumé's Booth line to two rendered lines
Drop the product name from the docx bullet, which means nothing to a
recruiter, and link the phrase "AI-native system" instead. The privacy
bullet now refers back to it as "its automation" and fits on one line.
The site keeps the fuller, named version.

Co-Authored-By: Claude Opus 5 <noreply@anthropic.com>
Claude-Session: https://claude.ai/code/session_011fUZkNUmpHXrNK2AyvguT1
</commit_message>
<xml_diff>
--- a/public/resume/malcolm-xavier-bullet-bank-template.docx
+++ b/public/resume/malcolm-xavier-bullet-bank-template.docx
@@ -40,7 +40,7 @@
       <w:pPr>
         <w:spacing w:after="240" w:before="0"/>
       </w:pPr>
-      <w:hyperlink w:history="1" r:id="rIdcr6teq5uy60nwsdgn_68v">
+      <w:hyperlink w:history="1" r:id="rIdlittmdqx7loj5xvg35plh">
         <w:r>
           <w:rPr>
             <w:rFonts w:ascii="DM Sans" w:cs="DM Sans" w:eastAsia="DM Sans" w:hAnsi="DM Sans"/>
@@ -69,7 +69,7 @@
         </w:rPr>
         <w:t xml:space="preserve"> · </w:t>
       </w:r>
-      <w:hyperlink w:history="1" r:id="rId4gdrvt1cxrryt9kovzywo">
+      <w:hyperlink w:history="1" r:id="rIdaq2sgrytpujzd2t_hrcdq">
         <w:r>
           <w:rPr>
             <w:rFonts w:ascii="DM Sans" w:cs="DM Sans" w:eastAsia="DM Sans" w:hAnsi="DM Sans"/>
@@ -98,7 +98,7 @@
         </w:rPr>
         <w:t xml:space="preserve"> · </w:t>
       </w:r>
-      <w:hyperlink w:history="1" r:id="rId3uhwk81bnzfpyx2ewaynz">
+      <w:hyperlink w:history="1" r:id="rIdp_4wcm1ev2nkmolczacez">
         <w:r>
           <w:rPr>
             <w:rFonts w:ascii="DM Sans" w:cs="DM Sans" w:eastAsia="DM Sans" w:hAnsi="DM Sans"/>
@@ -266,9 +266,9 @@
           <w:sz w:val="21"/>
           <w:szCs w:val="21"/>
         </w:rPr>
-        <w:t xml:space="preserve">Build and operate </w:t>
-      </w:r>
-      <w:hyperlink w:history="1" r:id="rId2toysmallkva33ep0bojx">
+        <w:t xml:space="preserve">Build and operate the </w:t>
+      </w:r>
+      <w:hyperlink w:history="1" r:id="rIdiuqgqtw8yv4sh-39x-mla">
         <w:r>
           <w:rPr>
             <w:rFonts w:ascii="DM Sans" w:cs="DM Sans" w:eastAsia="DM Sans" w:hAnsi="DM Sans"/>
@@ -281,7 +281,7 @@
             <w:szCs w:val="21"/>
             <w:u w:val="single" w:color="000000"/>
           </w:rPr>
-          <w:t xml:space="preserve">The Booth</w:t>
+          <w:t xml:space="preserve">AI-native system</w:t>
         </w:r>
       </w:hyperlink>
       <w:r>
@@ -295,46 +295,46 @@
           <w:sz w:val="21"/>
           <w:szCs w:val="21"/>
         </w:rPr>
-        <w:t xml:space="preserve"> on Claude Code, the AI-native system I plan and ship my own work from: one prioritized day across six workstreams, agents that run unattended on a schedule, and every automated write logged and reversible</w:t>
-      </w:r>
-    </w:p>
-    <w:p>
-      <w:pPr>
-        <w:pStyle w:val="ListParagraph"/>
-        <w:keepNext/>
-        <w:numPr>
-          <w:ilvl w:val="0"/>
-          <w:numId w:val="1"/>
-        </w:numPr>
-        <w:spacing w:after="40" w:before="0"/>
-        <w:ind w:left="288"/>
-      </w:pPr>
-      <w:r>
-        <w:rPr>
-          <w:rFonts w:ascii="DM Sans" w:cs="DM Sans" w:eastAsia="DM Sans" w:hAnsi="DM Sans"/>
-          <w:b w:val="false"/>
-          <w:bCs w:val="false"/>
-          <w:i w:val="false"/>
-          <w:iCs w:val="false"/>
-          <w:color w:val="000000"/>
-          <w:sz w:val="21"/>
-          <w:szCs w:val="21"/>
-        </w:rPr>
-        <w:t xml:space="preserve">Set the privacy rules for The Booth's automation: the jobs that can reach the internet can't reach personal data</w:t>
-      </w:r>
-    </w:p>
-    <w:p>
-      <w:pPr>
-        <w:pStyle w:val="ListParagraph"/>
-        <w:keepNext/>
-        <w:numPr>
-          <w:ilvl w:val="0"/>
-          <w:numId w:val="1"/>
-        </w:numPr>
-        <w:spacing w:after="40" w:before="0"/>
-        <w:ind w:left="288"/>
-      </w:pPr>
-      <w:hyperlink w:history="1" r:id="rIdk-j4ero5_j5sipywhiwpu">
+        <w:t xml:space="preserve"> I plan and ship my work from, on Claude Code: one prioritized day across six workstreams, scheduled agents, and every automated write logged and reversible</w:t>
+      </w:r>
+    </w:p>
+    <w:p>
+      <w:pPr>
+        <w:pStyle w:val="ListParagraph"/>
+        <w:keepNext/>
+        <w:numPr>
+          <w:ilvl w:val="0"/>
+          <w:numId w:val="1"/>
+        </w:numPr>
+        <w:spacing w:after="40" w:before="0"/>
+        <w:ind w:left="288"/>
+      </w:pPr>
+      <w:r>
+        <w:rPr>
+          <w:rFonts w:ascii="DM Sans" w:cs="DM Sans" w:eastAsia="DM Sans" w:hAnsi="DM Sans"/>
+          <w:b w:val="false"/>
+          <w:bCs w:val="false"/>
+          <w:i w:val="false"/>
+          <w:iCs w:val="false"/>
+          <w:color w:val="000000"/>
+          <w:sz w:val="21"/>
+          <w:szCs w:val="21"/>
+        </w:rPr>
+        <w:t xml:space="preserve">Set the privacy rules for its automation: the jobs that can reach the internet can't reach personal data</w:t>
+      </w:r>
+    </w:p>
+    <w:p>
+      <w:pPr>
+        <w:pStyle w:val="ListParagraph"/>
+        <w:keepNext/>
+        <w:numPr>
+          <w:ilvl w:val="0"/>
+          <w:numId w:val="1"/>
+        </w:numPr>
+        <w:spacing w:after="40" w:before="0"/>
+        <w:ind w:left="288"/>
+      </w:pPr>
+      <w:hyperlink w:history="1" r:id="rIdizdz77ebsvoxeabvbymj5">
         <w:r>
           <w:rPr>
             <w:rFonts w:ascii="DM Sans" w:cs="DM Sans" w:eastAsia="DM Sans" w:hAnsi="DM Sans"/>
@@ -375,7 +375,7 @@
         <w:spacing w:after="40" w:before="0"/>
         <w:ind w:left="288"/>
       </w:pPr>
-      <w:hyperlink w:history="1" r:id="rIdz1uuie3h4w1z4ohbr6b-q">
+      <w:hyperlink w:history="1" r:id="rIdz11yrhflctffcn_vlmgzs">
         <w:r>
           <w:rPr>
             <w:rFonts w:ascii="DM Sans" w:cs="DM Sans" w:eastAsia="DM Sans" w:hAnsi="DM Sans"/>
@@ -416,7 +416,7 @@
         <w:spacing w:after="40" w:before="0"/>
         <w:ind w:left="288"/>
       </w:pPr>
-      <w:hyperlink w:history="1" r:id="rIdc1ov5yznekrs6j8f97qbu">
+      <w:hyperlink w:history="1" r:id="rIdfa7uwoxz3zaydezfvxxo2">
         <w:r>
           <w:rPr>
             <w:rFonts w:ascii="DM Sans" w:cs="DM Sans" w:eastAsia="DM Sans" w:hAnsi="DM Sans"/>
@@ -520,7 +520,7 @@
         </w:rPr>
         <w:t xml:space="preserve">Created content marketing strategy for </w:t>
       </w:r>
-      <w:hyperlink w:history="1" r:id="rIdmgidsc2iqcv5y6lfxaajm">
+      <w:hyperlink w:history="1" r:id="rIdqlgwepg5gplkn6ikor5z9">
         <w:r>
           <w:rPr>
             <w:rFonts w:ascii="DM Sans" w:cs="DM Sans" w:eastAsia="DM Sans" w:hAnsi="DM Sans"/>
@@ -611,7 +611,7 @@
         <w:spacing w:after="40" w:before="0"/>
         <w:ind w:left="288"/>
       </w:pPr>
-      <w:hyperlink w:history="1" r:id="rIdpnnlck9rrewqwrlxx8xl-">
+      <w:hyperlink w:history="1" r:id="rIdgg7kh8dh5r_ouhy4rqjv5">
         <w:r>
           <w:rPr>
             <w:rFonts w:ascii="DM Sans" w:cs="DM Sans" w:eastAsia="DM Sans" w:hAnsi="DM Sans"/>
@@ -745,7 +745,7 @@
         <w:keepNext/>
         <w:spacing w:after="0" w:before="200"/>
       </w:pPr>
-      <w:hyperlink w:history="1" r:id="rIdud9dsqfz5i5_sh4p2ohmv">
+      <w:hyperlink w:history="1" r:id="rIdmeiqj2y3yk-uweh6p9c_e">
         <w:r>
           <w:rPr>
             <w:rFonts w:ascii="DM Sans" w:cs="DM Sans" w:eastAsia="DM Sans" w:hAnsi="DM Sans"/>
@@ -1364,7 +1364,7 @@
         <w:keepNext/>
         <w:spacing w:after="0" w:before="200"/>
       </w:pPr>
-      <w:hyperlink w:history="1" r:id="rIdns2f0ludpm3bwkwee3syl">
+      <w:hyperlink w:history="1" r:id="rIdrzbg5aea47mv5tgiel_mk">
         <w:r>
           <w:rPr>
             <w:rFonts w:ascii="DM Sans" w:cs="DM Sans" w:eastAsia="DM Sans" w:hAnsi="DM Sans"/>
@@ -1894,7 +1894,7 @@
         <w:keepNext/>
         <w:spacing w:after="0" w:before="200"/>
       </w:pPr>
-      <w:hyperlink w:history="1" r:id="rIdax-2srvm3jap2qcpq-_-v">
+      <w:hyperlink w:history="1" r:id="rIdbub2_9swlxhcdsuwgksag">
         <w:r>
           <w:rPr>
             <w:rFonts w:ascii="DM Sans" w:cs="DM Sans" w:eastAsia="DM Sans" w:hAnsi="DM Sans"/>
@@ -2211,7 +2211,7 @@
         <w:keepNext/>
         <w:spacing w:after="0" w:before="200"/>
       </w:pPr>
-      <w:hyperlink w:history="1" r:id="rIdrlj-beykuoxpd8ulubxpe">
+      <w:hyperlink w:history="1" r:id="rId20edsq8sdhzvsdrpv9dnr">
         <w:r>
           <w:rPr>
             <w:rFonts w:ascii="DM Sans" w:cs="DM Sans" w:eastAsia="DM Sans" w:hAnsi="DM Sans"/>
@@ -2478,7 +2478,7 @@
         <w:keepNext/>
         <w:spacing w:after="0" w:before="200"/>
       </w:pPr>
-      <w:hyperlink w:history="1" r:id="rIdijtgttkflcoqsjpe0wcll">
+      <w:hyperlink w:history="1" r:id="rId-bdelrgbfw9ytb4rgrolh">
         <w:r>
           <w:rPr>
             <w:rFonts w:ascii="DM Sans" w:cs="DM Sans" w:eastAsia="DM Sans" w:hAnsi="DM Sans"/>
@@ -2915,7 +2915,7 @@
         <w:keepNext/>
         <w:spacing w:after="0" w:before="0"/>
       </w:pPr>
-      <w:hyperlink w:history="1" r:id="rIdml95pap7ynv-88swlola3">
+      <w:hyperlink w:history="1" r:id="rIdma9ivzrc_wmkcey7rmtrw">
         <w:r>
           <w:rPr>
             <w:rFonts w:ascii="DM Sans" w:cs="DM Sans" w:eastAsia="DM Sans" w:hAnsi="DM Sans"/>
@@ -3069,7 +3069,7 @@
         <w:keepNext/>
         <w:spacing w:after="0" w:before="200"/>
       </w:pPr>
-      <w:hyperlink w:history="1" r:id="rIdp3a9g1umuk0xljpsdowrn">
+      <w:hyperlink w:history="1" r:id="rIdkemd6bc4r3ianswpe9sgr">
         <w:r>
           <w:rPr>
             <w:rFonts w:ascii="DM Sans" w:cs="DM Sans" w:eastAsia="DM Sans" w:hAnsi="DM Sans"/>
@@ -3198,7 +3198,7 @@
         <w:keepNext/>
         <w:spacing w:after="0" w:before="200"/>
       </w:pPr>
-      <w:hyperlink w:history="1" r:id="rIdnx_w4tavpckhsgrbnpl7n">
+      <w:hyperlink w:history="1" r:id="rIddrrkoq9ylrhibfxrqufm-">
         <w:r>
           <w:rPr>
             <w:rFonts w:ascii="DM Sans" w:cs="DM Sans" w:eastAsia="DM Sans" w:hAnsi="DM Sans"/>
@@ -3419,7 +3419,7 @@
       </w:pBdr>
       <w:spacing w:after="80" w:before="40"/>
     </w:pPr>
-    <w:hyperlink w:history="1" r:id="rIdpt0101q-rvx57jwrwvook">
+    <w:hyperlink w:history="1" r:id="rId1d77z3zpufwug9vnyhvcl">
       <w:r>
         <w:rPr>
           <w:rFonts w:ascii="DM Sans" w:cs="DM Sans" w:eastAsia="DM Sans" w:hAnsi="DM Sans"/>
@@ -3444,7 +3444,7 @@
       </w:rPr>
       <w:t xml:space="preserve"> · </w:t>
     </w:r>
-    <w:hyperlink w:history="1" r:id="rIdy-pz0dpxdkg5sc9riln0i">
+    <w:hyperlink w:history="1" r:id="rIdje6d4sev1n4nk26nzrazh">
       <w:r>
         <w:rPr>
           <w:rFonts w:ascii="DM Sans" w:cs="DM Sans" w:eastAsia="DM Sans" w:hAnsi="DM Sans"/>
@@ -3469,7 +3469,7 @@
       </w:rPr>
       <w:t xml:space="preserve"> · </w:t>
     </w:r>
-    <w:hyperlink w:history="1" r:id="rId8cgahtjziwrccbu_qrv_k">
+    <w:hyperlink w:history="1" r:id="rIdrfjvqm57cmmhdhlmbj1m_">
       <w:r>
         <w:rPr>
           <w:rFonts w:ascii="DM Sans" w:cs="DM Sans" w:eastAsia="DM Sans" w:hAnsi="DM Sans"/>

</xml_diff>

<commit_message>
Merge the strongest half of four claims the bank and canonical split
Each of these had a better half on each side. The recipe bullet takes
"and operations" from the bank and loses an article; the enrollment
revenue bullet takes "operationalizing" back, which also stops it
echoing "scaling" in the Fullstack line directly above it; the targeting
bullet takes "participant" from the bank and keeps canonical's named
metric; and the bank takes the dataflow wording a tailored cut had
written better weeks ago.

"Participant" cost a wrapped line and a third page. Dropping "features"
pays for it and reads tighter — implementing targeting implies building
something. All nine cuts verified back at their usual page counts.

Rebuilt the published assets and cascaded to the site résumé.

Co-Authored-By: Claude Opus 5 <noreply@anthropic.com>
Claude-Session: https://claude.ai/code/session_01CWVTXFvpVRBrzpeoAduaRs
</commit_message>
<xml_diff>
--- a/public/resume/malcolm-xavier-bullet-bank-template.docx
+++ b/public/resume/malcolm-xavier-bullet-bank-template.docx
@@ -40,7 +40,7 @@
       <w:pPr>
         <w:spacing w:after="240" w:before="0"/>
       </w:pPr>
-      <w:hyperlink w:history="1" r:id="rId2cyd6ru1m9ooal0afnijv">
+      <w:hyperlink w:history="1" r:id="rIdsil_ex9ckxxzlstahccxp">
         <w:r>
           <w:rPr>
             <w:rFonts w:ascii="DM Sans" w:cs="DM Sans" w:eastAsia="DM Sans" w:hAnsi="DM Sans"/>
@@ -69,7 +69,7 @@
         </w:rPr>
         <w:t xml:space="preserve"> · </w:t>
       </w:r>
-      <w:hyperlink w:history="1" r:id="rIdrzzunrddgcd3djmqykolo">
+      <w:hyperlink w:history="1" r:id="rId8key53zjiwduyijp6roan">
         <w:r>
           <w:rPr>
             <w:rFonts w:ascii="DM Sans" w:cs="DM Sans" w:eastAsia="DM Sans" w:hAnsi="DM Sans"/>
@@ -98,7 +98,7 @@
         </w:rPr>
         <w:t xml:space="preserve"> · </w:t>
       </w:r>
-      <w:hyperlink w:history="1" r:id="rIdzmwp9uq1ygp0nfvifxmdh">
+      <w:hyperlink w:history="1" r:id="rIdfejo8pvgyzkd4q3cynvvv">
         <w:r>
           <w:rPr>
             <w:rFonts w:ascii="DM Sans" w:cs="DM Sans" w:eastAsia="DM Sans" w:hAnsi="DM Sans"/>
@@ -268,7 +268,7 @@
         </w:rPr>
         <w:t xml:space="preserve">Build and operate the </w:t>
       </w:r>
-      <w:hyperlink w:history="1" r:id="rIdgm1lqrnrqwheisbwprpxd">
+      <w:hyperlink w:history="1" r:id="rIdrdscduj9s0thgq_4th75q">
         <w:r>
           <w:rPr>
             <w:rFonts w:ascii="DM Sans" w:cs="DM Sans" w:eastAsia="DM Sans" w:hAnsi="DM Sans"/>
@@ -334,7 +334,7 @@
         <w:spacing w:after="40" w:before="0"/>
         <w:ind w:left="288"/>
       </w:pPr>
-      <w:hyperlink w:history="1" r:id="rIdo-ij85szdfdpwf-yx7h_v">
+      <w:hyperlink w:history="1" r:id="rIdi5zqbdw72n535ffu_74u3">
         <w:r>
           <w:rPr>
             <w:rFonts w:ascii="DM Sans" w:cs="DM Sans" w:eastAsia="DM Sans" w:hAnsi="DM Sans"/>
@@ -375,7 +375,7 @@
         <w:spacing w:after="40" w:before="0"/>
         <w:ind w:left="288"/>
       </w:pPr>
-      <w:hyperlink w:history="1" r:id="rIdixl0cvvxksplbwtbzq7ab">
+      <w:hyperlink w:history="1" r:id="rId5jw4jt1qi9rkorpm0pfc4">
         <w:r>
           <w:rPr>
             <w:rFonts w:ascii="DM Sans" w:cs="DM Sans" w:eastAsia="DM Sans" w:hAnsi="DM Sans"/>
@@ -416,7 +416,7 @@
         <w:spacing w:after="40" w:before="0"/>
         <w:ind w:left="288"/>
       </w:pPr>
-      <w:hyperlink w:history="1" r:id="rId5g_hc4lceoymlpugqwksm">
+      <w:hyperlink w:history="1" r:id="rIdymbggoqenjewxo2higtkz">
         <w:r>
           <w:rPr>
             <w:rFonts w:ascii="DM Sans" w:cs="DM Sans" w:eastAsia="DM Sans" w:hAnsi="DM Sans"/>
@@ -520,7 +520,7 @@
         </w:rPr>
         <w:t xml:space="preserve">Created content marketing strategy for </w:t>
       </w:r>
-      <w:hyperlink w:history="1" r:id="rIdlo-ysjkvwzhxo5r2wbkda">
+      <w:hyperlink w:history="1" r:id="rId8cgsr1vcxt192tk__yi8g">
         <w:r>
           <w:rPr>
             <w:rFonts w:ascii="DM Sans" w:cs="DM Sans" w:eastAsia="DM Sans" w:hAnsi="DM Sans"/>
@@ -611,7 +611,7 @@
         <w:spacing w:after="40" w:before="0"/>
         <w:ind w:left="288"/>
       </w:pPr>
-      <w:hyperlink w:history="1" r:id="rId7yr86ssdp35msoc5lz2gs">
+      <w:hyperlink w:history="1" r:id="rIdei2z0uvkxxcdxdl7v1s9g">
         <w:r>
           <w:rPr>
             <w:rFonts w:ascii="DM Sans" w:cs="DM Sans" w:eastAsia="DM Sans" w:hAnsi="DM Sans"/>
@@ -745,7 +745,7 @@
         <w:keepNext/>
         <w:spacing w:after="0" w:before="200"/>
       </w:pPr>
-      <w:hyperlink w:history="1" r:id="rIdfopsfsbt144fdtzomqaxk">
+      <w:hyperlink w:history="1" r:id="rIdp18kfdh7vedenddwuymbc">
         <w:r>
           <w:rPr>
             <w:rFonts w:ascii="DM Sans" w:cs="DM Sans" w:eastAsia="DM Sans" w:hAnsi="DM Sans"/>
@@ -1364,7 +1364,7 @@
         <w:keepNext/>
         <w:spacing w:after="0" w:before="200"/>
       </w:pPr>
-      <w:hyperlink w:history="1" r:id="rIdkaur2403dq_9a6kk4et2j">
+      <w:hyperlink w:history="1" r:id="rIdgzvnp2funrqofdcbtbkn4">
         <w:r>
           <w:rPr>
             <w:rFonts w:ascii="DM Sans" w:cs="DM Sans" w:eastAsia="DM Sans" w:hAnsi="DM Sans"/>
@@ -1894,7 +1894,7 @@
         <w:keepNext/>
         <w:spacing w:after="0" w:before="200"/>
       </w:pPr>
-      <w:hyperlink w:history="1" r:id="rIdymqjnyhoblsyx1ffhkymd">
+      <w:hyperlink w:history="1" r:id="rIdxydwg7s1vsseonsjfld3r">
         <w:r>
           <w:rPr>
             <w:rFonts w:ascii="DM Sans" w:cs="DM Sans" w:eastAsia="DM Sans" w:hAnsi="DM Sans"/>
@@ -2003,7 +2003,7 @@
           <w:sz w:val="21"/>
           <w:szCs w:val="21"/>
         </w:rPr>
-        <w:t xml:space="preserve">Implemented participant targeting features that </w:t>
+        <w:t xml:space="preserve">Implemented participant targeting that </w:t>
       </w:r>
       <w:r>
         <w:rPr>
@@ -2016,7 +2016,7 @@
           <w:sz w:val="21"/>
           <w:szCs w:val="21"/>
         </w:rPr>
-        <w:t xml:space="preserve">improved key marketplace metric by 15%</w:t>
+        <w:t xml:space="preserve">improved core marketplace fulfillment metric by 15%</w:t>
       </w:r>
     </w:p>
     <w:p>
@@ -2211,7 +2211,7 @@
         <w:keepNext/>
         <w:spacing w:after="0" w:before="200"/>
       </w:pPr>
-      <w:hyperlink w:history="1" r:id="rIdmudjl90xcbtcwpmcnvftx">
+      <w:hyperlink w:history="1" r:id="rIdqiyqlgkqpb0ht6kkliv-x">
         <w:r>
           <w:rPr>
             <w:rFonts w:ascii="DM Sans" w:cs="DM Sans" w:eastAsia="DM Sans" w:hAnsi="DM Sans"/>
@@ -2308,7 +2308,7 @@
           <w:sz w:val="21"/>
           <w:szCs w:val="21"/>
         </w:rPr>
-        <w:t xml:space="preserve">$30M+ annual revenue (170% increase, YoY)</w:t>
+        <w:t xml:space="preserve">$30M+ in annual revenue (170% YoY increase)</w:t>
       </w:r>
       <w:r>
         <w:rPr>
@@ -2371,7 +2371,7 @@
           <w:sz w:val="21"/>
           <w:szCs w:val="21"/>
         </w:rPr>
-        <w:t xml:space="preserve">Monitored automation performance and API usage to ensure dataflow for 5k applicants, annually</w:t>
+        <w:t xml:space="preserve">Monitored automation performance and API usage to keep dataflow intact for 5,000 applicants annually</w:t>
       </w:r>
     </w:p>
     <w:p>
@@ -2478,7 +2478,7 @@
         <w:keepNext/>
         <w:spacing w:after="0" w:before="200"/>
       </w:pPr>
-      <w:hyperlink w:history="1" r:id="rId2ojhfldi_e8kwothh0d0r">
+      <w:hyperlink w:history="1" r:id="rIdy3k4rzeicyfm58itpa_qn">
         <w:r>
           <w:rPr>
             <w:rFonts w:ascii="DM Sans" w:cs="DM Sans" w:eastAsia="DM Sans" w:hAnsi="DM Sans"/>
@@ -2915,7 +2915,7 @@
         <w:keepNext/>
         <w:spacing w:after="0" w:before="0"/>
       </w:pPr>
-      <w:hyperlink w:history="1" r:id="rIdndkxozuhmvhxlf-i2zbjz">
+      <w:hyperlink w:history="1" r:id="rId3vvf_mxclrxbl5-hp5jvk">
         <w:r>
           <w:rPr>
             <w:rFonts w:ascii="DM Sans" w:cs="DM Sans" w:eastAsia="DM Sans" w:hAnsi="DM Sans"/>
@@ -3069,7 +3069,7 @@
         <w:keepNext/>
         <w:spacing w:after="0" w:before="200"/>
       </w:pPr>
-      <w:hyperlink w:history="1" r:id="rIdbsldt7ptahg32ktyxyvqr">
+      <w:hyperlink w:history="1" r:id="rIdo3hkzjotrks-todvuk5qz">
         <w:r>
           <w:rPr>
             <w:rFonts w:ascii="DM Sans" w:cs="DM Sans" w:eastAsia="DM Sans" w:hAnsi="DM Sans"/>
@@ -3198,7 +3198,7 @@
         <w:keepNext/>
         <w:spacing w:after="0" w:before="200"/>
       </w:pPr>
-      <w:hyperlink w:history="1" r:id="rIdjxz51l8ohefdh4c9frcxb">
+      <w:hyperlink w:history="1" r:id="rIdlyrj8mi0pbm9msgr3abdo">
         <w:r>
           <w:rPr>
             <w:rFonts w:ascii="DM Sans" w:cs="DM Sans" w:eastAsia="DM Sans" w:hAnsi="DM Sans"/>
@@ -3419,7 +3419,7 @@
       </w:pBdr>
       <w:spacing w:after="80" w:before="40"/>
     </w:pPr>
-    <w:hyperlink w:history="1" r:id="rIdaole_zzdn6_mcmp1c6ivx">
+    <w:hyperlink w:history="1" r:id="rIdjg55dtqcwnxu9trlr-lx2">
       <w:r>
         <w:rPr>
           <w:rFonts w:ascii="DM Sans" w:cs="DM Sans" w:eastAsia="DM Sans" w:hAnsi="DM Sans"/>
@@ -3444,7 +3444,7 @@
       </w:rPr>
       <w:t xml:space="preserve"> · </w:t>
     </w:r>
-    <w:hyperlink w:history="1" r:id="rIduqzbkv_pkpgywfbu-7yrs">
+    <w:hyperlink w:history="1" r:id="rIdkumvvzxkno7endevo9w8s">
       <w:r>
         <w:rPr>
           <w:rFonts w:ascii="DM Sans" w:cs="DM Sans" w:eastAsia="DM Sans" w:hAnsi="DM Sans"/>
@@ -3469,7 +3469,7 @@
       </w:rPr>
       <w:t xml:space="preserve"> · </w:t>
     </w:r>
-    <w:hyperlink w:history="1" r:id="rIdrrt9kdtajrgdrxrgaxgrw">
+    <w:hyperlink w:history="1" r:id="rIdsfkfcmar6bx7stqxseo_9">
       <w:r>
         <w:rPr>
           <w:rFonts w:ascii="DM Sans" w:cs="DM Sans" w:eastAsia="DM Sans" w:hAnsi="DM Sans"/>

</xml_diff>